<commit_message>
small updates to research notes and also incidental changes to PY file modes
</commit_message>
<xml_diff>
--- a/Research-Notes/Guy/WW-Program-Notes.docx
+++ b/Research-Notes/Guy/WW-Program-Notes.docx
@@ -9234,12 +9234,228 @@
         </w:rPr>
       </w:pPr>
     </w:p>
+    <w:p>
+      <w:r>
+        <w:t>[Jan 10, 2024] I got this one to merge, and start, but it promptly fails with unknown I/O addresses</w:t>
+      </w:r>
+    </w:p>
     <w:p/>
     <w:p>
       <w:r>
-        <w:t>[Jan 10, 2024] I got this one to merge, and start, but it promptly fails with unknown I/O addresses</w:t>
-      </w:r>
-    </w:p>
+        <w:t>[Sep 9, 2026]</w:t>
+      </w:r>
+    </w:p>
+    <w:p>
+      <w:r>
+        <w:t>Here’s the trace; none of it makes sense</w:t>
+      </w:r>
+    </w:p>
+    <w:p>
+      <w:pPr>
+        <w:rPr>
+          <w:color w:val="31849B" w:themeColor="accent5" w:themeShade="BF"/>
+          <w:sz w:val="14"/>
+          <w:szCs w:val="18"/>
+        </w:rPr>
+      </w:pPr>
+      <w:r>
+        <w:rPr>
+          <w:color w:val="31849B" w:themeColor="accent5" w:themeShade="BF"/>
+          <w:sz w:val="14"/>
+          <w:szCs w:val="18"/>
+        </w:rPr>
+        <w:t>Info: SI: PhotoElectricTapeReader A initialized in Char mode</w:t>
+      </w:r>
+    </w:p>
+    <w:p>
+      <w:pPr>
+        <w:rPr>
+          <w:color w:val="31849B" w:themeColor="accent5" w:themeShade="BF"/>
+          <w:sz w:val="14"/>
+          <w:szCs w:val="18"/>
+        </w:rPr>
+      </w:pPr>
+      <w:r>
+        <w:rPr>
+          <w:color w:val="31849B" w:themeColor="accent5" w:themeShade="BF"/>
+          <w:sz w:val="14"/>
+          <w:szCs w:val="18"/>
+        </w:rPr>
+        <w:t xml:space="preserve"> pc:0o2037:          SI 0o0200                AC=0o000000,           BR=0o0,    Core@0o0200= None    ;  select I/O: Mechanical Paper Tape Reader</w:t>
+      </w:r>
+    </w:p>
+    <w:p>
+      <w:pPr>
+        <w:rPr>
+          <w:color w:val="31849B" w:themeColor="accent5" w:themeShade="BF"/>
+          <w:sz w:val="14"/>
+          <w:szCs w:val="18"/>
+        </w:rPr>
+      </w:pPr>
+      <w:r>
+        <w:rPr>
+          <w:color w:val="31849B" w:themeColor="accent5" w:themeShade="BF"/>
+          <w:sz w:val="14"/>
+          <w:szCs w:val="18"/>
+        </w:rPr>
+        <w:t>Info: RD: PhotoElectricTapeReader A read character 0o25 (ascii '1')</w:t>
+      </w:r>
+    </w:p>
+    <w:p>
+      <w:pPr>
+        <w:rPr>
+          <w:color w:val="31849B" w:themeColor="accent5" w:themeShade="BF"/>
+          <w:sz w:val="14"/>
+          <w:szCs w:val="18"/>
+        </w:rPr>
+      </w:pPr>
+      <w:r>
+        <w:rPr>
+          <w:color w:val="31849B" w:themeColor="accent5" w:themeShade="BF"/>
+          <w:sz w:val="14"/>
+          <w:szCs w:val="18"/>
+        </w:rPr>
+        <w:t xml:space="preserve"> pc:0o2040:          RD 0o0002                AC=0o000025,           BR=0o0,    Core@0o0002=0o000000  ;  RD: PhotoElectricTapeReader: 0o25 ('1')</w:t>
+      </w:r>
+    </w:p>
+    <w:p>
+      <w:pPr>
+        <w:rPr>
+          <w:color w:val="31849B" w:themeColor="accent5" w:themeShade="BF"/>
+          <w:sz w:val="14"/>
+          <w:szCs w:val="18"/>
+        </w:rPr>
+      </w:pPr>
+      <w:r>
+        <w:rPr>
+          <w:color w:val="31849B" w:themeColor="accent5" w:themeShade="BF"/>
+          <w:sz w:val="14"/>
+          <w:szCs w:val="18"/>
+        </w:rPr>
+        <w:t xml:space="preserve"> pc:0o2041:          CA 0o0015                AC=0o130024(-0o47753), BR=0o0,    Core@0o0015=0o130024(-0o47753)  ;</w:t>
+      </w:r>
+    </w:p>
+    <w:p>
+      <w:pPr>
+        <w:rPr>
+          <w:color w:val="31849B" w:themeColor="accent5" w:themeShade="BF"/>
+          <w:sz w:val="14"/>
+          <w:szCs w:val="18"/>
+        </w:rPr>
+      </w:pPr>
+      <w:r>
+        <w:rPr>
+          <w:color w:val="31849B" w:themeColor="accent5" w:themeShade="BF"/>
+          <w:sz w:val="14"/>
+          <w:szCs w:val="18"/>
+        </w:rPr>
+        <w:t>Reading Uninitialized Memory at location 0o407, bank 0</w:t>
+      </w:r>
+    </w:p>
+    <w:p>
+      <w:pPr>
+        <w:rPr>
+          <w:color w:val="31849B" w:themeColor="accent5" w:themeShade="BF"/>
+          <w:sz w:val="14"/>
+          <w:szCs w:val="18"/>
+        </w:rPr>
+      </w:pPr>
+      <w:r>
+        <w:rPr>
+          <w:color w:val="31849B" w:themeColor="accent5" w:themeShade="BF"/>
+          <w:sz w:val="14"/>
+          <w:szCs w:val="18"/>
+        </w:rPr>
+        <w:t>Info: RD: PhotoElectricTapeReader A read character 0o10 (ascii ' ')</w:t>
+      </w:r>
+    </w:p>
+    <w:p>
+      <w:pPr>
+        <w:rPr>
+          <w:color w:val="31849B" w:themeColor="accent5" w:themeShade="BF"/>
+          <w:sz w:val="14"/>
+          <w:szCs w:val="18"/>
+        </w:rPr>
+      </w:pPr>
+      <w:r>
+        <w:rPr>
+          <w:color w:val="31849B" w:themeColor="accent5" w:themeShade="BF"/>
+          <w:sz w:val="14"/>
+          <w:szCs w:val="18"/>
+        </w:rPr>
+        <w:t xml:space="preserve"> pc:0o2042:          RD 0o0407                AC=0o000010,           BR=0o0,    Core@0o0407= None    ;  RD: PhotoElectricTapeReader: 0o10 (' ')</w:t>
+      </w:r>
+    </w:p>
+    <w:p>
+      <w:pPr>
+        <w:rPr>
+          <w:color w:val="31849B" w:themeColor="accent5" w:themeShade="BF"/>
+          <w:sz w:val="14"/>
+          <w:szCs w:val="18"/>
+        </w:rPr>
+      </w:pPr>
+      <w:r>
+        <w:rPr>
+          <w:color w:val="31849B" w:themeColor="accent5" w:themeShade="BF"/>
+          <w:sz w:val="14"/>
+          <w:szCs w:val="18"/>
+        </w:rPr>
+        <w:t>SI: unknown IO address 0o45: si 0o45 (octal 45 / decimal 37) is not in 2M-0277 Table 5 -- no matching I/O device/mode found.</w:t>
+      </w:r>
+    </w:p>
+    <w:p>
+      <w:pPr>
+        <w:rPr>
+          <w:color w:val="31849B" w:themeColor="accent5" w:themeShade="BF"/>
+          <w:sz w:val="14"/>
+          <w:szCs w:val="18"/>
+        </w:rPr>
+      </w:pPr>
+      <w:r>
+        <w:rPr>
+          <w:color w:val="31849B" w:themeColor="accent5" w:themeShade="BF"/>
+          <w:sz w:val="14"/>
+          <w:szCs w:val="18"/>
+        </w:rPr>
+        <w:t xml:space="preserve"> pc:0o2043:          SI 0o0045                AC=0o000010,           BR=0o0,    Core@0o0045= None    ;  select I/O: unknown i/o device</w:t>
+      </w:r>
+    </w:p>
+    <w:p>
+      <w:pPr>
+        <w:rPr>
+          <w:color w:val="31849B" w:themeColor="accent5" w:themeShade="BF"/>
+          <w:sz w:val="14"/>
+          <w:szCs w:val="18"/>
+        </w:rPr>
+      </w:pPr>
+      <w:r>
+        <w:rPr>
+          <w:color w:val="31849B" w:themeColor="accent5" w:themeShade="BF"/>
+          <w:sz w:val="14"/>
+          <w:szCs w:val="18"/>
+        </w:rPr>
+        <w:t>Alarm 'Unknown I/O Device' (4) at PC=0o2043 (0d1059)</w:t>
+      </w:r>
+    </w:p>
+    <w:p>
+      <w:pPr>
+        <w:rPr>
+          <w:color w:val="31849B" w:themeColor="accent5" w:themeShade="BF"/>
+          <w:sz w:val="14"/>
+          <w:szCs w:val="18"/>
+        </w:rPr>
+      </w:pPr>
+      <w:r>
+        <w:rPr>
+          <w:color w:val="31849B" w:themeColor="accent5" w:themeShade="BF"/>
+          <w:sz w:val="14"/>
+          <w:szCs w:val="18"/>
+        </w:rPr>
+        <w:t>Total cycles = 4, last PC=0o2044, wall_clock_time=0 sec, avg time per cycle =  0.0 usec, ww_time = 112.0 usec</w:t>
+      </w:r>
+    </w:p>
+    <w:p/>
+    <w:p/>
     <w:p/>
     <w:p/>
     <w:p>
@@ -9360,6 +9576,79 @@
     <w:p/>
     <w:p/>
     <w:p>
+      <w:r>
+        <w:t>[Aug 28, 2026]</w:t>
+      </w:r>
+    </w:p>
+    <w:p/>
+    <w:p>
+      <w:r>
+        <w:t xml:space="preserve">hi Juan, Larry, </w:t>
+      </w:r>
+      <w:r>
+        <w:br/>
+        <w:t xml:space="preserve">  I took a quick try at getting what I think is one the assemblers, "Basic Converter" to operate.  Definitely just a start...  it does run, but appears to fail in several different dimensions. </w:t>
+      </w:r>
+      <w:r>
+        <w:br/>
+        <w:t xml:space="preserve">  The least expected is that it fails if the second character on the input tape (that is, the program to be assembled) is not '|'...  no idea why, but that's easy to work around. </w:t>
+      </w:r>
+      <w:r>
+        <w:br/>
+        <w:t xml:space="preserve">  The second failure is when it hits a CF bank switch instruction, apparently to address 13 of bank 3.  No surprise, there's nothing in the bank. </w:t>
+      </w:r>
+      <w:r>
+        <w:br/>
+      </w:r>
+      <w:r>
+        <w:lastRenderedPageBreak/>
+        <w:t xml:space="preserve">We've never successfully traced through a CF instruction, and it seems that as a side effect, this makes my trace utility go a bit crazy.  I'll stare at that some more, but in the meantime, I overwrote the CF with a halt. </w:t>
+      </w:r>
+      <w:r>
+        <w:br/>
+        <w:t xml:space="preserve">  The third failure seems to be that it does this CF call in the middle of reading what ought to be the tape name specifier.  I assume this means that I don't have the right input format yet. </w:t>
+      </w:r>
+      <w:r>
+        <w:br/>
+      </w:r>
+      <w:r>
+        <w:br/>
+        <w:t xml:space="preserve">  The extracted flow chart is quite complex; it runs some 200+ instructions before halting, so it's doing _something_, but I don't know what... </w:t>
+      </w:r>
+      <w:r>
+        <w:br/>
+      </w:r>
+      <w:r>
+        <w:br/>
+        <w:t xml:space="preserve">  Along the way, I modified the trace mechanism to decode I/O operations as they happen; it's easy to see that RC and RD and write and read, but it's not so easy to tell from a bare execution trace what they do... </w:t>
+      </w:r>
+      <w:r>
+        <w:br/>
+      </w:r>
+      <w:r>
+        <w:br/>
+        <w:t xml:space="preserve">  I'm in California this week, but maybe push on this a bit more next week. </w:t>
+      </w:r>
+      <w:r>
+        <w:br/>
+      </w:r>
+      <w:r>
+        <w:br/>
+        <w:t xml:space="preserve">  All this stuff is checked into guy-dev. GitHub/Code-Samples/Basic-Conversion has the images, my proto-cs source file, and a Makefile. </w:t>
+      </w:r>
+      <w:r>
+        <w:br/>
+      </w:r>
+      <w:r>
+        <w:br/>
+        <w:t xml:space="preserve">/guy </w:t>
+      </w:r>
+      <w:r>
+        <w:br/>
+      </w:r>
+    </w:p>
+    <w:p/>
+    <w:p>
       <w:pPr>
         <w:pStyle w:val="Heading3"/>
       </w:pPr>
@@ -9730,6 +10019,7 @@
     </w:p>
     <w:p>
       <w:r>
+        <w:lastRenderedPageBreak/>
         <w:t>Status: started July 31, 2019</w:t>
       </w:r>
     </w:p>
@@ -10088,7 +10378,7 @@
         </w:rPr>
         <w:lastRenderedPageBreak/>
         <w:drawing>
-          <wp:inline distT="0" distB="0" distL="0" distR="0" wp14:anchorId="240637F3" wp14:editId="5ECB03AB">
+          <wp:inline distT="0" distB="0" distL="0" distR="0" wp14:anchorId="240637F3" wp14:editId="5147E53B">
             <wp:extent cx="3562350" cy="4296302"/>
             <wp:effectExtent l="0" t="0" r="0" b="9525"/>
             <wp:docPr id="6" name="Picture 6"/>
@@ -18057,7 +18347,7 @@
       <w:rPr>
         <w:noProof/>
       </w:rPr>
-      <w:t>August 21, 2026</w:t>
+      <w:t>September 9, 2026</w:t>
     </w:r>
     <w:r>
       <w:rPr>

</xml_diff>

<commit_message>
small changes to notes; added wwpatch to Whirlwind-Development-Environment.docx
</commit_message>
<xml_diff>
--- a/Research-Notes/Guy/WW-Program-Notes.docx
+++ b/Research-Notes/Guy/WW-Program-Notes.docx
@@ -9071,18 +9071,16 @@
       </w:r>
       <w:bookmarkEnd w:id="11"/>
     </w:p>
+    <w:p/>
     <w:p>
       <w:pPr>
         <w:pStyle w:val="Heading3"/>
       </w:pPr>
-      <w:bookmarkStart w:id="12" w:name="_Toc199515468"/>
-      <w:r>
-        <w:t>FB2703sa</w:t>
+      <w:bookmarkStart w:id="12" w:name="_Toc199515470"/>
+      <w:r>
+        <w:t>Basic Converter T3600</w:t>
       </w:r>
       <w:bookmarkEnd w:id="12"/>
-      <w:r>
-        <w:t xml:space="preserve"> </w:t>
-      </w:r>
     </w:p>
     <w:p>
       <w:pPr>
@@ -9102,7 +9100,7 @@
           <w:sz w:val="18"/>
           <w:szCs w:val="18"/>
         </w:rPr>
-        <w:t>102766905_2037_basic_conversion_start_at_2037.7ch</w:t>
+        <w:t>102782043_3600m0_basic_conversion_5-13-54_copy.7ch</w:t>
       </w:r>
     </w:p>
     <w:p>
@@ -9125,7 +9123,7 @@
           <w:sz w:val="18"/>
           <w:szCs w:val="18"/>
         </w:rPr>
-        <w:t>102766905_2037_basic_conversion_start_at_2037_gs001.tcore</w:t>
+        <w:t>102782043_3600m0_basic_conversion_5-13-54_copy_gs001.tcore</w:t>
       </w:r>
     </w:p>
     <w:p>
@@ -9148,7 +9146,7 @@
           <w:sz w:val="18"/>
           <w:szCs w:val="18"/>
         </w:rPr>
-        <w:t>102766905_2037_basic_conversion_start_at_2037_gs002_nwwin.tcore</w:t>
+        <w:t>102782043_3600m0_basic_conversion_5-13-54_copy_gs002_NWWIN.tcore</w:t>
       </w:r>
     </w:p>
     <w:p>
@@ -9171,7 +9169,13 @@
           <w:sz w:val="18"/>
           <w:szCs w:val="18"/>
         </w:rPr>
-        <w:t>102766905_2037_basic_conversion_start_at_2037_gs003.tcore</w:t>
+        <w:t>102782043_3600m0_basic_conversion_5-13-54_copy_gs003.tcore</w:t>
+      </w:r>
+    </w:p>
+    <w:p/>
+    <w:p>
+      <w:r>
+        <w:t>Status: As of Jan 4, 2024, this executable traps on unknown I/O devices.  [That, we can fix!]</w:t>
       </w:r>
     </w:p>
     <w:p>
@@ -9182,19 +9186,332 @@
         <w:spacing w:before="0" w:after="0"/>
         <w:rPr>
           <w:rFonts w:ascii="Lucida Console" w:hAnsi="Lucida Console" w:cs="Lucida Console"/>
-          <w:color w:val="76923C" w:themeColor="accent3" w:themeShade="BF"/>
           <w:sz w:val="18"/>
           <w:szCs w:val="18"/>
         </w:rPr>
       </w:pPr>
       <w:r>
+        <w:rPr>
+          <w:rFonts w:ascii="Lucida Console" w:hAnsi="Lucida Console" w:cs="Lucida Console"/>
+          <w:sz w:val="18"/>
+          <w:szCs w:val="18"/>
+        </w:rPr>
+        <w:t>$ wwsim *gs001* --NoAl</w:t>
+      </w:r>
+    </w:p>
+    <w:p>
+      <w:pPr>
+        <w:autoSpaceDE w:val="0"/>
+        <w:autoSpaceDN w:val="0"/>
+        <w:adjustRightInd w:val="0"/>
+        <w:spacing w:before="0" w:after="0"/>
+        <w:rPr>
+          <w:rFonts w:ascii="Lucida Console" w:hAnsi="Lucida Console" w:cs="Lucida Console"/>
+          <w:sz w:val="18"/>
+          <w:szCs w:val="18"/>
+        </w:rPr>
+      </w:pPr>
+      <w:r>
+        <w:rPr>
+          <w:rFonts w:ascii="Lucida Console" w:hAnsi="Lucida Console" w:cs="Lucida Console"/>
+          <w:sz w:val="18"/>
+          <w:szCs w:val="18"/>
+        </w:rPr>
+        <w:t>Info: Automatically return 0 and 1 from locations 0 and 1</w:t>
+      </w:r>
+    </w:p>
+    <w:p>
+      <w:pPr>
+        <w:autoSpaceDE w:val="0"/>
+        <w:autoSpaceDN w:val="0"/>
+        <w:adjustRightInd w:val="0"/>
+        <w:spacing w:before="0" w:after="0"/>
+        <w:rPr>
+          <w:rFonts w:ascii="Lucida Console" w:hAnsi="Lucida Console" w:cs="Lucida Console"/>
+          <w:sz w:val="18"/>
+          <w:szCs w:val="18"/>
+        </w:rPr>
+      </w:pPr>
+      <w:r>
+        <w:rPr>
+          <w:rFonts w:ascii="Lucida Console" w:hAnsi="Lucida Console" w:cs="Lucida Console"/>
+          <w:sz w:val="18"/>
+          <w:szCs w:val="18"/>
+        </w:rPr>
+        <w:t>Info: core file 102782043_3600m0_basic_conversion_5-13-54_copy_gs001.tcore</w:t>
+      </w:r>
+    </w:p>
+    <w:p>
+      <w:pPr>
+        <w:autoSpaceDE w:val="0"/>
+        <w:autoSpaceDN w:val="0"/>
+        <w:adjustRightInd w:val="0"/>
+        <w:spacing w:before="0" w:after="0"/>
+        <w:rPr>
+          <w:rFonts w:ascii="Lucida Console" w:hAnsi="Lucida Console" w:cs="Lucida Console"/>
+          <w:sz w:val="18"/>
+          <w:szCs w:val="18"/>
+        </w:rPr>
+      </w:pPr>
+      <w:r>
+        <w:rPr>
+          <w:rFonts w:ascii="Lucida Console" w:hAnsi="Lucida Console" w:cs="Lucida Console"/>
+          <w:sz w:val="18"/>
+          <w:szCs w:val="18"/>
+        </w:rPr>
+        <w:t>Info: Whirlwind tape file name: 102782043_3600m0_basic_conversion_5-13-54_copy.7ch/102782043_3600m0_basic_conversion_5-13-54_copy_gs001.tcore</w:t>
+      </w:r>
+    </w:p>
+    <w:p>
+      <w:pPr>
+        <w:autoSpaceDE w:val="0"/>
+        <w:autoSpaceDN w:val="0"/>
+        <w:adjustRightInd w:val="0"/>
+        <w:spacing w:before="0" w:after="0"/>
+        <w:rPr>
+          <w:rFonts w:ascii="Lucida Console" w:hAnsi="Lucida Console" w:cs="Lucida Console"/>
+          <w:sz w:val="18"/>
+          <w:szCs w:val="18"/>
+        </w:rPr>
+      </w:pPr>
+      <w:r>
+        <w:rPr>
+          <w:rFonts w:ascii="Lucida Console" w:hAnsi="Lucida Console" w:cs="Lucida Console"/>
+          <w:sz w:val="18"/>
+          <w:szCs w:val="18"/>
+        </w:rPr>
+        <w:t>Info: corefile JumpTo address = 02037o</w:t>
+      </w:r>
+    </w:p>
+    <w:p>
+      <w:pPr>
+        <w:autoSpaceDE w:val="0"/>
+        <w:autoSpaceDN w:val="0"/>
+        <w:adjustRightInd w:val="0"/>
+        <w:spacing w:before="0" w:after="0"/>
+        <w:rPr>
+          <w:rFonts w:ascii="Lucida Console" w:hAnsi="Lucida Console" w:cs="Lucida Console"/>
+          <w:sz w:val="18"/>
+          <w:szCs w:val="18"/>
+        </w:rPr>
+      </w:pPr>
+      <w:r>
+        <w:rPr>
+          <w:rFonts w:ascii="Lucida Console" w:hAnsi="Lucida Console" w:cs="Lucida Console"/>
+          <w:sz w:val="18"/>
+          <w:szCs w:val="18"/>
+        </w:rPr>
+        <w:t>Info: starting corefile blocknum 00o</w:t>
+      </w:r>
+    </w:p>
+    <w:p>
+      <w:pPr>
+        <w:autoSpaceDE w:val="0"/>
+        <w:autoSpaceDN w:val="0"/>
+        <w:adjustRightInd w:val="0"/>
+        <w:spacing w:before="0" w:after="0"/>
+        <w:rPr>
+          <w:rFonts w:ascii="Lucida Console" w:hAnsi="Lucida Console" w:cs="Lucida Console"/>
+          <w:sz w:val="18"/>
+          <w:szCs w:val="18"/>
+        </w:rPr>
+      </w:pPr>
+      <w:r>
+        <w:rPr>
+          <w:rFonts w:ascii="Lucida Console" w:hAnsi="Lucida Console" w:cs="Lucida Console"/>
+          <w:sz w:val="18"/>
+          <w:szCs w:val="18"/>
+        </w:rPr>
+        <w:t>Switch CheckAlarmSpecial=0</w:t>
+      </w:r>
+    </w:p>
+    <w:p>
+      <w:pPr>
+        <w:autoSpaceDE w:val="0"/>
+        <w:autoSpaceDN w:val="0"/>
+        <w:adjustRightInd w:val="0"/>
+        <w:spacing w:before="0" w:after="0"/>
+        <w:rPr>
+          <w:rFonts w:ascii="Lucida Console" w:hAnsi="Lucida Console" w:cs="Lucida Console"/>
+          <w:sz w:val="18"/>
+          <w:szCs w:val="18"/>
+        </w:rPr>
+      </w:pPr>
+      <w:r>
+        <w:rPr>
+          <w:rFonts w:ascii="Lucida Console" w:hAnsi="Lucida Console" w:cs="Lucida Console"/>
+          <w:sz w:val="18"/>
+          <w:szCs w:val="18"/>
+        </w:rPr>
+        <w:t>start at 0o2037</w:t>
+      </w:r>
+    </w:p>
+    <w:p>
+      <w:pPr>
+        <w:autoSpaceDE w:val="0"/>
+        <w:autoSpaceDN w:val="0"/>
+        <w:adjustRightInd w:val="0"/>
+        <w:spacing w:before="0" w:after="0"/>
+        <w:rPr>
+          <w:rFonts w:ascii="Lucida Console" w:hAnsi="Lucida Console" w:cs="Lucida Console"/>
+          <w:sz w:val="18"/>
+          <w:szCs w:val="18"/>
+        </w:rPr>
+      </w:pPr>
+      <w:r>
+        <w:rPr>
+          <w:rFonts w:ascii="Lucida Console" w:hAnsi="Lucida Console" w:cs="Lucida Console"/>
+          <w:sz w:val="18"/>
+          <w:szCs w:val="18"/>
+        </w:rPr>
+        <w:t>SI: unknown IO address 0o200</w:t>
+      </w:r>
+    </w:p>
+    <w:p>
+      <w:pPr>
+        <w:autoSpaceDE w:val="0"/>
+        <w:autoSpaceDN w:val="0"/>
+        <w:adjustRightInd w:val="0"/>
+        <w:spacing w:before="0" w:after="0"/>
+        <w:rPr>
+          <w:rFonts w:ascii="Lucida Console" w:hAnsi="Lucida Console" w:cs="Lucida Console"/>
+          <w:sz w:val="18"/>
+          <w:szCs w:val="18"/>
+        </w:rPr>
+      </w:pPr>
+      <w:r>
+        <w:rPr>
+          <w:rFonts w:ascii="Lucida Console" w:hAnsi="Lucida Console" w:cs="Lucida Console"/>
+          <w:sz w:val="18"/>
+          <w:szCs w:val="18"/>
+        </w:rPr>
+        <w:t>Alarm 'Unknown I/O Device' (4) at PC=0o2037 (0d1055)</w:t>
+      </w:r>
+    </w:p>
+    <w:p/>
+    <w:p>
+      <w:r>
+        <w:t xml:space="preserve">Moved to GitHub/Code-Samples/Basic-Conversion. </w:t>
+      </w:r>
+    </w:p>
+    <w:p>
+      <w:r>
+        <w:t>Status – as of Sep 9, 2026</w:t>
+      </w:r>
+    </w:p>
+    <w:p>
+      <w:pPr>
+        <w:rPr>
+          <w:b/>
+          <w:bCs/>
+        </w:rPr>
+      </w:pPr>
+      <w:r>
+        <w:rPr>
+          <w:b/>
+          <w:bCs/>
+        </w:rPr>
+        <w:t>102782043_3600m0_basic_conversion_5-13-54_copy</w:t>
+      </w:r>
+    </w:p>
+    <w:p>
+      <w:pPr>
+        <w:pStyle w:val="ListParagraph"/>
+        <w:numPr>
+          <w:ilvl w:val="0"/>
+          <w:numId w:val="10"/>
+        </w:numPr>
+      </w:pPr>
+      <w:r>
+        <w:t>Merged the three tcore files</w:t>
+      </w:r>
+    </w:p>
+    <w:p>
+      <w:pPr>
+        <w:pStyle w:val="ListParagraph"/>
+        <w:numPr>
+          <w:ilvl w:val="0"/>
+          <w:numId w:val="10"/>
+        </w:numPr>
+      </w:pPr>
+      <w:r>
+        <w:t>Ran with a new ‘source’ file</w:t>
+      </w:r>
+    </w:p>
+    <w:p>
+      <w:pPr>
+        <w:pStyle w:val="ListParagraph"/>
+        <w:numPr>
+          <w:ilvl w:val="0"/>
+          <w:numId w:val="10"/>
+        </w:numPr>
+      </w:pPr>
+      <w:r>
+        <w:t>Today, it runs about 7,000 cycles and then halts upon trying to initialize a tape punch.</w:t>
+      </w:r>
+    </w:p>
+    <w:p>
+      <w:r>
+        <w:t>It does write something into core starting at 0o40, but it sure doesn’t look like it’s “working”.</w:t>
+      </w:r>
+    </w:p>
+    <w:p/>
+    <w:p/>
+    <w:p>
+      <w:pPr>
+        <w:pStyle w:val="Heading3"/>
+      </w:pPr>
+      <w:bookmarkStart w:id="13" w:name="_Toc199515468"/>
+      <w:r>
+        <w:t>FB2703sa</w:t>
+      </w:r>
+      <w:bookmarkEnd w:id="13"/>
+      <w:r>
+        <w:t xml:space="preserve"> </w:t>
+      </w:r>
+    </w:p>
+    <w:p>
+      <w:pPr>
+        <w:autoSpaceDE w:val="0"/>
+        <w:autoSpaceDN w:val="0"/>
+        <w:adjustRightInd w:val="0"/>
+        <w:spacing w:before="0" w:after="0"/>
+        <w:rPr>
+          <w:rFonts w:ascii="Lucida Console" w:hAnsi="Lucida Console" w:cs="Lucida Console"/>
+          <w:sz w:val="18"/>
+          <w:szCs w:val="18"/>
+        </w:rPr>
+      </w:pPr>
+      <w:r>
+        <w:rPr>
+          <w:rFonts w:ascii="Lucida Console" w:hAnsi="Lucida Console" w:cs="Lucida Console"/>
+          <w:sz w:val="18"/>
+          <w:szCs w:val="18"/>
+        </w:rPr>
+        <w:t>102766905_2037_basic_conversion_start_at_2037.7ch</w:t>
+      </w:r>
+    </w:p>
+    <w:p>
+      <w:pPr>
+        <w:autoSpaceDE w:val="0"/>
+        <w:autoSpaceDN w:val="0"/>
+        <w:adjustRightInd w:val="0"/>
+        <w:spacing w:before="0" w:after="0"/>
         <w:rPr>
           <w:rFonts w:ascii="Lucida Console" w:hAnsi="Lucida Console" w:cs="Lucida Console"/>
           <w:color w:val="76923C" w:themeColor="accent3" w:themeShade="BF"/>
           <w:sz w:val="18"/>
           <w:szCs w:val="18"/>
         </w:rPr>
-        <w:t>converter_merged.tcore</w:t>
+      </w:pPr>
+      <w:r>
+        <w:rPr>
+          <w:rFonts w:ascii="Lucida Console" w:hAnsi="Lucida Console" w:cs="Lucida Console"/>
+          <w:color w:val="76923C" w:themeColor="accent3" w:themeShade="BF"/>
+          <w:sz w:val="18"/>
+          <w:szCs w:val="18"/>
+        </w:rPr>
+        <w:t>102766905_2037_basic_conversion_start_at_2037_gs001.tcore</w:t>
       </w:r>
     </w:p>
     <w:p>
@@ -9217,7 +9534,7 @@
           <w:sz w:val="18"/>
           <w:szCs w:val="18"/>
         </w:rPr>
-        <w:t>converter_merged.ww</w:t>
+        <w:t>102766905_2037_basic_conversion_start_at_2037_gs002_nwwin.tcore</w:t>
       </w:r>
     </w:p>
     <w:p>
@@ -9228,6 +9545,75 @@
         <w:spacing w:before="0" w:after="0"/>
         <w:rPr>
           <w:rFonts w:ascii="Lucida Console" w:hAnsi="Lucida Console" w:cs="Lucida Console"/>
+          <w:color w:val="76923C" w:themeColor="accent3" w:themeShade="BF"/>
+          <w:sz w:val="18"/>
+          <w:szCs w:val="18"/>
+        </w:rPr>
+      </w:pPr>
+      <w:r>
+        <w:rPr>
+          <w:rFonts w:ascii="Lucida Console" w:hAnsi="Lucida Console" w:cs="Lucida Console"/>
+          <w:color w:val="76923C" w:themeColor="accent3" w:themeShade="BF"/>
+          <w:sz w:val="18"/>
+          <w:szCs w:val="18"/>
+        </w:rPr>
+        <w:t>102766905_2037_basic_conversion_start_at_2037_gs003.tcore</w:t>
+      </w:r>
+    </w:p>
+    <w:p>
+      <w:pPr>
+        <w:autoSpaceDE w:val="0"/>
+        <w:autoSpaceDN w:val="0"/>
+        <w:adjustRightInd w:val="0"/>
+        <w:spacing w:before="0" w:after="0"/>
+        <w:rPr>
+          <w:rFonts w:ascii="Lucida Console" w:hAnsi="Lucida Console" w:cs="Lucida Console"/>
+          <w:color w:val="76923C" w:themeColor="accent3" w:themeShade="BF"/>
+          <w:sz w:val="18"/>
+          <w:szCs w:val="18"/>
+        </w:rPr>
+      </w:pPr>
+      <w:r>
+        <w:rPr>
+          <w:rFonts w:ascii="Lucida Console" w:hAnsi="Lucida Console" w:cs="Lucida Console"/>
+          <w:color w:val="76923C" w:themeColor="accent3" w:themeShade="BF"/>
+          <w:sz w:val="18"/>
+          <w:szCs w:val="18"/>
+        </w:rPr>
+        <w:t>converter_merged.tcore</w:t>
+      </w:r>
+    </w:p>
+    <w:p>
+      <w:pPr>
+        <w:autoSpaceDE w:val="0"/>
+        <w:autoSpaceDN w:val="0"/>
+        <w:adjustRightInd w:val="0"/>
+        <w:spacing w:before="0" w:after="0"/>
+        <w:rPr>
+          <w:rFonts w:ascii="Lucida Console" w:hAnsi="Lucida Console" w:cs="Lucida Console"/>
+          <w:color w:val="76923C" w:themeColor="accent3" w:themeShade="BF"/>
+          <w:sz w:val="18"/>
+          <w:szCs w:val="18"/>
+        </w:rPr>
+      </w:pPr>
+      <w:r>
+        <w:rPr>
+          <w:rFonts w:ascii="Lucida Console" w:hAnsi="Lucida Console" w:cs="Lucida Console"/>
+          <w:color w:val="76923C" w:themeColor="accent3" w:themeShade="BF"/>
+          <w:sz w:val="18"/>
+          <w:szCs w:val="18"/>
+        </w:rPr>
+        <w:t>converter_merged.ww</w:t>
+      </w:r>
+    </w:p>
+    <w:p>
+      <w:pPr>
+        <w:autoSpaceDE w:val="0"/>
+        <w:autoSpaceDN w:val="0"/>
+        <w:adjustRightInd w:val="0"/>
+        <w:spacing w:before="0" w:after="0"/>
+        <w:rPr>
+          <w:rFonts w:ascii="Lucida Console" w:hAnsi="Lucida Console" w:cs="Lucida Console"/>
           <w:color w:val="00F200"/>
           <w:sz w:val="18"/>
           <w:szCs w:val="18"/>
@@ -9238,6 +9624,9 @@
       <w:r>
         <w:t>[Jan 10, 2024] I got this one to merge, and start, but it promptly fails with unknown I/O addresses</w:t>
       </w:r>
+      <w:r>
+        <w:t xml:space="preserve"> (I mean, unknown to 2M-0277, not just me!)</w:t>
+      </w:r>
     </w:p>
     <w:p/>
     <w:p>
@@ -9332,6 +9721,7 @@
           <w:sz w:val="14"/>
           <w:szCs w:val="18"/>
         </w:rPr>
+        <w:lastRenderedPageBreak/>
         <w:t xml:space="preserve"> pc:0o2041:          CA 0o0015                AC=0o130024(-0o47753), BR=0o0,    Core@0o0015=0o130024(-0o47753)  ;</w:t>
       </w:r>
     </w:p>
@@ -9462,11 +9852,11 @@
       <w:pPr>
         <w:pStyle w:val="Heading3"/>
       </w:pPr>
-      <w:bookmarkStart w:id="13" w:name="_Toc199515469"/>
+      <w:bookmarkStart w:id="14" w:name="_Toc199515469"/>
       <w:r>
         <w:t>FB2037</w:t>
       </w:r>
-      <w:bookmarkEnd w:id="13"/>
+      <w:bookmarkEnd w:id="14"/>
     </w:p>
     <w:p>
       <w:pPr>
@@ -9599,9 +9989,6 @@
       </w:r>
       <w:r>
         <w:br/>
-      </w:r>
-      <w:r>
-        <w:lastRenderedPageBreak/>
         <w:t xml:space="preserve">We've never successfully traced through a CF instruction, and it seems that as a side effect, this makes my trace utility go a bit crazy.  I'll stare at that some more, but in the meantime, I overwrote the CF with a halt. </w:t>
       </w:r>
       <w:r>
@@ -9648,335 +10035,14 @@
       </w:r>
     </w:p>
     <w:p/>
+    <w:p/>
     <w:p>
       <w:pPr>
         <w:pStyle w:val="Heading3"/>
       </w:pPr>
-      <w:bookmarkStart w:id="14" w:name="_Toc199515470"/>
-      <w:r>
-        <w:t>Basic Converter</w:t>
-      </w:r>
-      <w:r>
-        <w:t xml:space="preserve"> T3600</w:t>
-      </w:r>
-      <w:bookmarkEnd w:id="14"/>
-    </w:p>
-    <w:p>
-      <w:pPr>
-        <w:autoSpaceDE w:val="0"/>
-        <w:autoSpaceDN w:val="0"/>
-        <w:adjustRightInd w:val="0"/>
-        <w:spacing w:before="0" w:after="0"/>
-        <w:rPr>
-          <w:rFonts w:ascii="Lucida Console" w:hAnsi="Lucida Console" w:cs="Lucida Console"/>
-          <w:sz w:val="18"/>
-          <w:szCs w:val="18"/>
-        </w:rPr>
-      </w:pPr>
-      <w:r>
-        <w:rPr>
-          <w:rFonts w:ascii="Lucida Console" w:hAnsi="Lucida Console" w:cs="Lucida Console"/>
-          <w:sz w:val="18"/>
-          <w:szCs w:val="18"/>
-        </w:rPr>
-        <w:t>102782043_3600m0_basic_conversion_5-13-54_copy.7ch</w:t>
-      </w:r>
-    </w:p>
-    <w:p>
-      <w:pPr>
-        <w:autoSpaceDE w:val="0"/>
-        <w:autoSpaceDN w:val="0"/>
-        <w:adjustRightInd w:val="0"/>
-        <w:spacing w:before="0" w:after="0"/>
-        <w:rPr>
-          <w:rFonts w:ascii="Lucida Console" w:hAnsi="Lucida Console" w:cs="Lucida Console"/>
-          <w:color w:val="76923C" w:themeColor="accent3" w:themeShade="BF"/>
-          <w:sz w:val="18"/>
-          <w:szCs w:val="18"/>
-        </w:rPr>
-      </w:pPr>
-      <w:r>
-        <w:rPr>
-          <w:rFonts w:ascii="Lucida Console" w:hAnsi="Lucida Console" w:cs="Lucida Console"/>
-          <w:color w:val="76923C" w:themeColor="accent3" w:themeShade="BF"/>
-          <w:sz w:val="18"/>
-          <w:szCs w:val="18"/>
-        </w:rPr>
-        <w:t>102782043_3600m0_basic_conversion_5-13-54_copy_gs001.tcore</w:t>
-      </w:r>
-    </w:p>
-    <w:p>
-      <w:pPr>
-        <w:autoSpaceDE w:val="0"/>
-        <w:autoSpaceDN w:val="0"/>
-        <w:adjustRightInd w:val="0"/>
-        <w:spacing w:before="0" w:after="0"/>
-        <w:rPr>
-          <w:rFonts w:ascii="Lucida Console" w:hAnsi="Lucida Console" w:cs="Lucida Console"/>
-          <w:color w:val="76923C" w:themeColor="accent3" w:themeShade="BF"/>
-          <w:sz w:val="18"/>
-          <w:szCs w:val="18"/>
-        </w:rPr>
-      </w:pPr>
-      <w:r>
-        <w:rPr>
-          <w:rFonts w:ascii="Lucida Console" w:hAnsi="Lucida Console" w:cs="Lucida Console"/>
-          <w:color w:val="76923C" w:themeColor="accent3" w:themeShade="BF"/>
-          <w:sz w:val="18"/>
-          <w:szCs w:val="18"/>
-        </w:rPr>
-        <w:t>102782043_3600m0_basic_conversion_5-13-54_copy_gs002_NWWIN.tcore</w:t>
-      </w:r>
-    </w:p>
-    <w:p>
-      <w:pPr>
-        <w:autoSpaceDE w:val="0"/>
-        <w:autoSpaceDN w:val="0"/>
-        <w:adjustRightInd w:val="0"/>
-        <w:spacing w:before="0" w:after="0"/>
-        <w:rPr>
-          <w:rFonts w:ascii="Lucida Console" w:hAnsi="Lucida Console" w:cs="Lucida Console"/>
-          <w:color w:val="76923C" w:themeColor="accent3" w:themeShade="BF"/>
-          <w:sz w:val="18"/>
-          <w:szCs w:val="18"/>
-        </w:rPr>
-      </w:pPr>
-      <w:r>
-        <w:rPr>
-          <w:rFonts w:ascii="Lucida Console" w:hAnsi="Lucida Console" w:cs="Lucida Console"/>
-          <w:color w:val="76923C" w:themeColor="accent3" w:themeShade="BF"/>
-          <w:sz w:val="18"/>
-          <w:szCs w:val="18"/>
-        </w:rPr>
-        <w:t>102782043_3600m0_basic_conversion_5-13-54_copy_gs003.tcore</w:t>
-      </w:r>
-    </w:p>
-    <w:p/>
-    <w:p>
-      <w:r>
-        <w:t xml:space="preserve">Status: </w:t>
-      </w:r>
-      <w:r>
-        <w:t>As of Jan 4, 2024, this executable traps on unknown I/O devices.  [That, we can fix!]</w:t>
-      </w:r>
-    </w:p>
-    <w:p>
-      <w:pPr>
-        <w:autoSpaceDE w:val="0"/>
-        <w:autoSpaceDN w:val="0"/>
-        <w:adjustRightInd w:val="0"/>
-        <w:spacing w:before="0" w:after="0"/>
-        <w:rPr>
-          <w:rFonts w:ascii="Lucida Console" w:hAnsi="Lucida Console" w:cs="Lucida Console"/>
-          <w:sz w:val="18"/>
-          <w:szCs w:val="18"/>
-        </w:rPr>
-      </w:pPr>
-      <w:r>
-        <w:rPr>
-          <w:rFonts w:ascii="Lucida Console" w:hAnsi="Lucida Console" w:cs="Lucida Console"/>
-          <w:sz w:val="18"/>
-          <w:szCs w:val="18"/>
-        </w:rPr>
-        <w:t>$ wwsim *gs001* --NoAl</w:t>
-      </w:r>
-    </w:p>
-    <w:p>
-      <w:pPr>
-        <w:autoSpaceDE w:val="0"/>
-        <w:autoSpaceDN w:val="0"/>
-        <w:adjustRightInd w:val="0"/>
-        <w:spacing w:before="0" w:after="0"/>
-        <w:rPr>
-          <w:rFonts w:ascii="Lucida Console" w:hAnsi="Lucida Console" w:cs="Lucida Console"/>
-          <w:sz w:val="18"/>
-          <w:szCs w:val="18"/>
-        </w:rPr>
-      </w:pPr>
-      <w:r>
-        <w:rPr>
-          <w:rFonts w:ascii="Lucida Console" w:hAnsi="Lucida Console" w:cs="Lucida Console"/>
-          <w:sz w:val="18"/>
-          <w:szCs w:val="18"/>
-        </w:rPr>
-        <w:t>Info: Automatically return 0 and 1 from locations 0 and 1</w:t>
-      </w:r>
-    </w:p>
-    <w:p>
-      <w:pPr>
-        <w:autoSpaceDE w:val="0"/>
-        <w:autoSpaceDN w:val="0"/>
-        <w:adjustRightInd w:val="0"/>
-        <w:spacing w:before="0" w:after="0"/>
-        <w:rPr>
-          <w:rFonts w:ascii="Lucida Console" w:hAnsi="Lucida Console" w:cs="Lucida Console"/>
-          <w:sz w:val="18"/>
-          <w:szCs w:val="18"/>
-        </w:rPr>
-      </w:pPr>
-      <w:r>
-        <w:rPr>
-          <w:rFonts w:ascii="Lucida Console" w:hAnsi="Lucida Console" w:cs="Lucida Console"/>
-          <w:sz w:val="18"/>
-          <w:szCs w:val="18"/>
-        </w:rPr>
-        <w:t>Info: core file 102782043_3600m0_basic_conversion_5-13-54_copy_gs001.tcore</w:t>
-      </w:r>
-    </w:p>
-    <w:p>
-      <w:pPr>
-        <w:autoSpaceDE w:val="0"/>
-        <w:autoSpaceDN w:val="0"/>
-        <w:adjustRightInd w:val="0"/>
-        <w:spacing w:before="0" w:after="0"/>
-        <w:rPr>
-          <w:rFonts w:ascii="Lucida Console" w:hAnsi="Lucida Console" w:cs="Lucida Console"/>
-          <w:sz w:val="18"/>
-          <w:szCs w:val="18"/>
-        </w:rPr>
-      </w:pPr>
-      <w:r>
-        <w:rPr>
-          <w:rFonts w:ascii="Lucida Console" w:hAnsi="Lucida Console" w:cs="Lucida Console"/>
-          <w:sz w:val="18"/>
-          <w:szCs w:val="18"/>
-        </w:rPr>
-        <w:t>Info: Whirlwind tape file name: 102782043_3600m0_basic_conversion_5-13-54_copy.7ch/102782043_3600m0_basic_conversion_5-13-54_copy_gs001.tcore</w:t>
-      </w:r>
-    </w:p>
-    <w:p>
-      <w:pPr>
-        <w:autoSpaceDE w:val="0"/>
-        <w:autoSpaceDN w:val="0"/>
-        <w:adjustRightInd w:val="0"/>
-        <w:spacing w:before="0" w:after="0"/>
-        <w:rPr>
-          <w:rFonts w:ascii="Lucida Console" w:hAnsi="Lucida Console" w:cs="Lucida Console"/>
-          <w:sz w:val="18"/>
-          <w:szCs w:val="18"/>
-        </w:rPr>
-      </w:pPr>
-      <w:r>
-        <w:rPr>
-          <w:rFonts w:ascii="Lucida Console" w:hAnsi="Lucida Console" w:cs="Lucida Console"/>
-          <w:sz w:val="18"/>
-          <w:szCs w:val="18"/>
-        </w:rPr>
-        <w:t>Info: corefile JumpTo address = 02037o</w:t>
-      </w:r>
-    </w:p>
-    <w:p>
-      <w:pPr>
-        <w:autoSpaceDE w:val="0"/>
-        <w:autoSpaceDN w:val="0"/>
-        <w:adjustRightInd w:val="0"/>
-        <w:spacing w:before="0" w:after="0"/>
-        <w:rPr>
-          <w:rFonts w:ascii="Lucida Console" w:hAnsi="Lucida Console" w:cs="Lucida Console"/>
-          <w:sz w:val="18"/>
-          <w:szCs w:val="18"/>
-        </w:rPr>
-      </w:pPr>
-      <w:r>
-        <w:rPr>
-          <w:rFonts w:ascii="Lucida Console" w:hAnsi="Lucida Console" w:cs="Lucida Console"/>
-          <w:sz w:val="18"/>
-          <w:szCs w:val="18"/>
-        </w:rPr>
-        <w:t>Info: starting corefile blocknum 00o</w:t>
-      </w:r>
-    </w:p>
-    <w:p>
-      <w:pPr>
-        <w:autoSpaceDE w:val="0"/>
-        <w:autoSpaceDN w:val="0"/>
-        <w:adjustRightInd w:val="0"/>
-        <w:spacing w:before="0" w:after="0"/>
-        <w:rPr>
-          <w:rFonts w:ascii="Lucida Console" w:hAnsi="Lucida Console" w:cs="Lucida Console"/>
-          <w:sz w:val="18"/>
-          <w:szCs w:val="18"/>
-        </w:rPr>
-      </w:pPr>
-      <w:r>
-        <w:rPr>
-          <w:rFonts w:ascii="Lucida Console" w:hAnsi="Lucida Console" w:cs="Lucida Console"/>
-          <w:sz w:val="18"/>
-          <w:szCs w:val="18"/>
-        </w:rPr>
-        <w:t>Switch CheckAlarmSpecial=0</w:t>
-      </w:r>
-    </w:p>
-    <w:p>
-      <w:pPr>
-        <w:autoSpaceDE w:val="0"/>
-        <w:autoSpaceDN w:val="0"/>
-        <w:adjustRightInd w:val="0"/>
-        <w:spacing w:before="0" w:after="0"/>
-        <w:rPr>
-          <w:rFonts w:ascii="Lucida Console" w:hAnsi="Lucida Console" w:cs="Lucida Console"/>
-          <w:sz w:val="18"/>
-          <w:szCs w:val="18"/>
-        </w:rPr>
-      </w:pPr>
-      <w:r>
-        <w:rPr>
-          <w:rFonts w:ascii="Lucida Console" w:hAnsi="Lucida Console" w:cs="Lucida Console"/>
-          <w:sz w:val="18"/>
-          <w:szCs w:val="18"/>
-        </w:rPr>
-        <w:t>start at 0o2037</w:t>
-      </w:r>
-    </w:p>
-    <w:p>
-      <w:pPr>
-        <w:autoSpaceDE w:val="0"/>
-        <w:autoSpaceDN w:val="0"/>
-        <w:adjustRightInd w:val="0"/>
-        <w:spacing w:before="0" w:after="0"/>
-        <w:rPr>
-          <w:rFonts w:ascii="Lucida Console" w:hAnsi="Lucida Console" w:cs="Lucida Console"/>
-          <w:sz w:val="18"/>
-          <w:szCs w:val="18"/>
-        </w:rPr>
-      </w:pPr>
-      <w:r>
-        <w:rPr>
-          <w:rFonts w:ascii="Lucida Console" w:hAnsi="Lucida Console" w:cs="Lucida Console"/>
-          <w:sz w:val="18"/>
-          <w:szCs w:val="18"/>
-        </w:rPr>
-        <w:t>SI: unknown IO address 0o200</w:t>
-      </w:r>
-    </w:p>
-    <w:p>
-      <w:pPr>
-        <w:autoSpaceDE w:val="0"/>
-        <w:autoSpaceDN w:val="0"/>
-        <w:adjustRightInd w:val="0"/>
-        <w:spacing w:before="0" w:after="0"/>
-        <w:rPr>
-          <w:rFonts w:ascii="Lucida Console" w:hAnsi="Lucida Console" w:cs="Lucida Console"/>
-          <w:sz w:val="18"/>
-          <w:szCs w:val="18"/>
-        </w:rPr>
-      </w:pPr>
-      <w:r>
-        <w:rPr>
-          <w:rFonts w:ascii="Lucida Console" w:hAnsi="Lucida Console" w:cs="Lucida Console"/>
-          <w:sz w:val="18"/>
-          <w:szCs w:val="18"/>
-        </w:rPr>
-        <w:t>Alarm 'Unknown I/O Device' (4) at PC=0o2037 (0d1055)</w:t>
-      </w:r>
-    </w:p>
-    <w:p/>
-    <w:p>
-      <w:pPr>
-        <w:pStyle w:val="Heading3"/>
-      </w:pPr>
       <w:bookmarkStart w:id="15" w:name="_Toc199515471"/>
       <w:r>
+        <w:lastRenderedPageBreak/>
         <w:t>Photo-Electric Converter – M-1232</w:t>
       </w:r>
       <w:bookmarkEnd w:id="15"/>
@@ -10019,7 +10085,6 @@
     </w:p>
     <w:p>
       <w:r>
-        <w:lastRenderedPageBreak/>
         <w:t>Status: started July 31, 2019</w:t>
       </w:r>
     </w:p>

</xml_diff>